<commit_message>
Add project report for predictive market demand analysis in e-commerce
</commit_message>
<xml_diff>
--- a/Documentation/ML_project.docx
+++ b/Documentation/ML_project.docx
@@ -257,12 +257,14 @@
         </w:rPr>
         <w:t xml:space="preserve"> </w:t>
       </w:r>
+      <w:proofErr w:type="spellStart"/>
       <w:r>
         <w:rPr>
           <w:color w:val="DE0C0C"/>
         </w:rPr>
         <w:t>Machhe</w:t>
       </w:r>
+      <w:proofErr w:type="spellEnd"/>
       <w:r>
         <w:rPr>
           <w:color w:val="DE0C0C"/>
@@ -1525,6 +1527,7 @@
         </w:rPr>
         <w:t xml:space="preserve"> </w:t>
       </w:r>
+      <w:proofErr w:type="gramStart"/>
       <w:r>
         <w:rPr>
           <w:b/>
@@ -1533,6 +1536,7 @@
         </w:rPr>
         <w:t>Affiliated</w:t>
       </w:r>
+      <w:proofErr w:type="gramEnd"/>
       <w:r>
         <w:rPr>
           <w:b/>
@@ -2112,11 +2116,19 @@
         </w:rPr>
         <w:t xml:space="preserve"> </w:t>
       </w:r>
-      <w:r>
-        <w:rPr>
-          <w:sz w:val="24"/>
-        </w:rPr>
-        <w:t xml:space="preserve">bonafide students of </w:t>
+      <w:proofErr w:type="spellStart"/>
+      <w:r>
+        <w:rPr>
+          <w:sz w:val="24"/>
+        </w:rPr>
+        <w:t>bonafide</w:t>
+      </w:r>
+      <w:proofErr w:type="spellEnd"/>
+      <w:r>
+        <w:rPr>
+          <w:sz w:val="24"/>
+        </w:rPr>
+        <w:t xml:space="preserve"> students of </w:t>
       </w:r>
       <w:r>
         <w:rPr>
@@ -2632,7 +2644,21 @@
         <w:rPr>
           <w:lang w:val="en-IN"/>
         </w:rPr>
-        <w:t>The methodology follows a structured workflow consisting of data collection, preprocessing, feature selection, model training, prediction, and evaluation. Performance will be analyzed using evaluation metrics such as RMSE, MAE, and R² score. The expected outcome of the project is an efficient and scalable forecasting system capable of improving demand prediction accuracy in e-commerce environments.</w:t>
+        <w:t xml:space="preserve">The methodology follows a structured workflow consisting of data collection, preprocessing, feature selection, model training, prediction, and evaluation. Performance will be </w:t>
+      </w:r>
+      <w:proofErr w:type="spellStart"/>
+      <w:r>
+        <w:rPr>
+          <w:lang w:val="en-IN"/>
+        </w:rPr>
+        <w:t>analyzed</w:t>
+      </w:r>
+      <w:proofErr w:type="spellEnd"/>
+      <w:r>
+        <w:rPr>
+          <w:lang w:val="en-IN"/>
+        </w:rPr>
+        <w:t xml:space="preserve"> using evaluation metrics such as RMSE, MAE, and R² score. The expected outcome of the project is an efficient and scalable forecasting system capable of improving demand prediction accuracy in e-commerce environments.</w:t>
       </w:r>
     </w:p>
     <w:p>
@@ -2793,7 +2819,25 @@
           <w:szCs w:val="24"/>
           <w:lang w:val="en-IN" w:eastAsia="en-IN"/>
         </w:rPr>
-        <w:t>The purpose of this project is to develop a Machine Learning-based demand forecasting system using Linear Regression and Support Vector Machine (SVM). The system focuses on analyzing e-commerce pricing and revenue data to predict future demand trends. The proposed solution uses the dataset “indian_ecommerce_pricing_revenue_growth_36_months” and applies machine learning algorithms to identify patterns and relationships in the data. The system aims to improve forecasting accuracy, reduce manual effort, and support efficient financial and inventory management.</w:t>
+        <w:t xml:space="preserve">The purpose of this project is to develop a Machine Learning-based demand forecasting system using Linear Regression and Support Vector Machine (SVM). The system focuses on </w:t>
+      </w:r>
+      <w:proofErr w:type="spellStart"/>
+      <w:r>
+        <w:rPr>
+          <w:sz w:val="24"/>
+          <w:szCs w:val="24"/>
+          <w:lang w:val="en-IN" w:eastAsia="en-IN"/>
+        </w:rPr>
+        <w:t>analyzing</w:t>
+      </w:r>
+      <w:proofErr w:type="spellEnd"/>
+      <w:r>
+        <w:rPr>
+          <w:sz w:val="24"/>
+          <w:szCs w:val="24"/>
+          <w:lang w:val="en-IN" w:eastAsia="en-IN"/>
+        </w:rPr>
+        <w:t xml:space="preserve"> e-commerce pricing and revenue data to predict future demand trends. The proposed solution uses the dataset “indian_ecommerce_pricing_revenue_growth_36_months” and applies machine learning algorithms to identify patterns and relationships in the data. The system aims to improve forecasting accuracy, reduce manual effort, and support efficient financial and inventory management.</w:t>
       </w:r>
     </w:p>
     <w:p>
@@ -2839,7 +2883,25 @@
           <w:szCs w:val="24"/>
           <w:lang w:val="en-IN" w:eastAsia="en-IN"/>
         </w:rPr>
-        <w:t>In the current e-commerce environment, businesses generate large amounts of transactional and pricing data daily. Organizations rely on forecasting methods to estimate future demand and maintain proper inventory levels. Traditional forecasting systems mainly depend on statistical and manual approaches, which often fail to handle changing customer behavior, seasonal variations, and complex market trends.</w:t>
+        <w:t xml:space="preserve">In the current e-commerce environment, businesses generate large amounts of transactional and pricing data daily. Organizations rely on forecasting methods to estimate future demand and maintain proper inventory levels. Traditional forecasting systems mainly depend on statistical and manual approaches, which often fail to handle changing customer </w:t>
+      </w:r>
+      <w:proofErr w:type="spellStart"/>
+      <w:r>
+        <w:rPr>
+          <w:sz w:val="24"/>
+          <w:szCs w:val="24"/>
+          <w:lang w:val="en-IN" w:eastAsia="en-IN"/>
+        </w:rPr>
+        <w:t>behavior</w:t>
+      </w:r>
+      <w:proofErr w:type="spellEnd"/>
+      <w:r>
+        <w:rPr>
+          <w:sz w:val="24"/>
+          <w:szCs w:val="24"/>
+          <w:lang w:val="en-IN" w:eastAsia="en-IN"/>
+        </w:rPr>
+        <w:t>, seasonal variations, and complex market trends.</w:t>
       </w:r>
     </w:p>
     <w:p>
@@ -2883,7 +2945,25 @@
           <w:szCs w:val="24"/>
           <w:lang w:val="en-IN" w:eastAsia="en-IN"/>
         </w:rPr>
-        <w:t>The increasing availability of large datasets and advancements in machine learning have created the need for automated and intelligent forecasting systems. Machine learning models can analyze both linear and non-linear relationships in data, making them more suitable for modern e-commerce analytics</w:t>
+        <w:t xml:space="preserve">The increasing availability of large datasets and advancements in machine learning have created the need for automated and intelligent forecasting systems. Machine learning models can </w:t>
+      </w:r>
+      <w:proofErr w:type="spellStart"/>
+      <w:r>
+        <w:rPr>
+          <w:sz w:val="24"/>
+          <w:szCs w:val="24"/>
+          <w:lang w:val="en-IN" w:eastAsia="en-IN"/>
+        </w:rPr>
+        <w:t>analyze</w:t>
+      </w:r>
+      <w:proofErr w:type="spellEnd"/>
+      <w:r>
+        <w:rPr>
+          <w:sz w:val="24"/>
+          <w:szCs w:val="24"/>
+          <w:lang w:val="en-IN" w:eastAsia="en-IN"/>
+        </w:rPr>
+        <w:t xml:space="preserve"> both linear and non-linear relationships in data, making them more suitable for modern e-commerce analytics</w:t>
       </w:r>
       <w:r>
         <w:rPr>
@@ -3005,7 +3085,25 @@
           <w:szCs w:val="24"/>
           <w:lang w:val="en-IN" w:eastAsia="en-IN"/>
         </w:rPr>
-        <w:t>The technologies and tools planned for the project include Python, Pandas, NumPy, Matplotlib, Scikit-learn, and Google Colab. The dataset used is “indian_ecommerce_pricing_revenue_growth_36_months,” which contains information related to pricing, revenue, and monthly growth trends.</w:t>
+        <w:t xml:space="preserve">The technologies and tools planned for the project include Python, Pandas, NumPy, Matplotlib, Scikit-learn, and Google </w:t>
+      </w:r>
+      <w:proofErr w:type="spellStart"/>
+      <w:r>
+        <w:rPr>
+          <w:sz w:val="24"/>
+          <w:szCs w:val="24"/>
+          <w:lang w:val="en-IN" w:eastAsia="en-IN"/>
+        </w:rPr>
+        <w:t>Colab</w:t>
+      </w:r>
+      <w:proofErr w:type="spellEnd"/>
+      <w:r>
+        <w:rPr>
+          <w:sz w:val="24"/>
+          <w:szCs w:val="24"/>
+          <w:lang w:val="en-IN" w:eastAsia="en-IN"/>
+        </w:rPr>
+        <w:t>. The dataset used is “indian_ecommerce_pricing_revenue_growth_36_months,” which contains information related to pricing, revenue, and monthly growth trends.</w:t>
       </w:r>
     </w:p>
     <w:p>
@@ -3241,7 +3339,21 @@
         <w:rPr>
           <w:lang w:val="en-IN"/>
         </w:rPr>
-        <w:t>The project focuses on demand forecasting in the e-commerce domain using machine learning techniques. The system can be used for predicting revenue and analyzing demand trends based on historical pricing and sales-related data. The proposed solution is useful for e-commerce businesses, retailers, financial analysts, and inventory management teams.</w:t>
+        <w:t xml:space="preserve">The project focuses on demand forecasting in the e-commerce domain using machine learning techniques. The system can be used for predicting revenue and </w:t>
+      </w:r>
+      <w:proofErr w:type="spellStart"/>
+      <w:r>
+        <w:rPr>
+          <w:lang w:val="en-IN"/>
+        </w:rPr>
+        <w:t>analyzing</w:t>
+      </w:r>
+      <w:proofErr w:type="spellEnd"/>
+      <w:r>
+        <w:rPr>
+          <w:lang w:val="en-IN"/>
+        </w:rPr>
+        <w:t xml:space="preserve"> demand trends based on historical pricing and sales-related data. The proposed solution is useful for e-commerce businesses, retailers, financial analysts, and inventory management teams.</w:t>
       </w:r>
     </w:p>
     <w:p>
@@ -3670,7 +3782,21 @@
         <w:rPr>
           <w:lang w:val="en-IN" w:eastAsia="en-IN"/>
         </w:rPr>
-        <w:t>Ability to analyze both linear and non-linear demand patterns</w:t>
+        <w:t xml:space="preserve">Ability to </w:t>
+      </w:r>
+      <w:proofErr w:type="spellStart"/>
+      <w:r>
+        <w:rPr>
+          <w:lang w:val="en-IN" w:eastAsia="en-IN"/>
+        </w:rPr>
+        <w:t>analyze</w:t>
+      </w:r>
+      <w:proofErr w:type="spellEnd"/>
+      <w:r>
+        <w:rPr>
+          <w:lang w:val="en-IN" w:eastAsia="en-IN"/>
+        </w:rPr>
+        <w:t xml:space="preserve"> both linear and non-linear demand patterns</w:t>
       </w:r>
     </w:p>
     <w:p>
@@ -3825,7 +3951,21 @@
           <w:lang w:val="en-IN"/>
         </w:rPr>
         <w:br/>
-        <w:t xml:space="preserve">Describes the practical implementation of the project using Google Colab, Python libraries, dataset handling, preprocessing, and model development. </w:t>
+        <w:t xml:space="preserve">Describes the practical implementation of the project using Google </w:t>
+      </w:r>
+      <w:proofErr w:type="spellStart"/>
+      <w:r>
+        <w:rPr>
+          <w:lang w:val="en-IN"/>
+        </w:rPr>
+        <w:t>Colab</w:t>
+      </w:r>
+      <w:proofErr w:type="spellEnd"/>
+      <w:r>
+        <w:rPr>
+          <w:lang w:val="en-IN"/>
+        </w:rPr>
+        <w:t xml:space="preserve">, Python libraries, dataset handling, preprocessing, and model development. </w:t>
       </w:r>
     </w:p>
     <w:p>
@@ -4687,8 +4827,16 @@
               <w:rPr>
                 <w:lang w:val="en-IN"/>
               </w:rPr>
-              <w:t>Dataset specific and lacks hybrid modeling</w:t>
+              <w:t xml:space="preserve">Dataset specific and lacks hybrid </w:t>
             </w:r>
+            <w:proofErr w:type="spellStart"/>
+            <w:r>
+              <w:rPr>
+                <w:lang w:val="en-IN"/>
+              </w:rPr>
+              <w:t>modeling</w:t>
+            </w:r>
+            <w:proofErr w:type="spellEnd"/>
           </w:p>
         </w:tc>
       </w:tr>
@@ -4769,7 +4917,21 @@
               <w:rPr>
                 <w:lang w:val="en-IN"/>
               </w:rPr>
-              <w:t>ARIMA and XGBoost hybrid forecasting using Kaggle retail demand dataset</w:t>
+              <w:t xml:space="preserve">ARIMA and </w:t>
+            </w:r>
+            <w:proofErr w:type="spellStart"/>
+            <w:r>
+              <w:rPr>
+                <w:lang w:val="en-IN"/>
+              </w:rPr>
+              <w:t>XGBoost</w:t>
+            </w:r>
+            <w:proofErr w:type="spellEnd"/>
+            <w:r>
+              <w:rPr>
+                <w:lang w:val="en-IN"/>
+              </w:rPr>
+              <w:t xml:space="preserve"> hybrid forecasting using Kaggle retail demand dataset</w:t>
             </w:r>
           </w:p>
         </w:tc>
@@ -5156,13 +5318,23 @@
                 <w:lang w:val="en-IN"/>
               </w:rPr>
             </w:pPr>
+            <w:proofErr w:type="spellStart"/>
             <w:r>
               <w:rPr>
                 <w:i/>
                 <w:iCs/>
                 <w:lang w:val="en-IN"/>
               </w:rPr>
-              <w:t>SmartMart – An Automated Shopping Mart with Blink and Facial Recognition for Payment</w:t>
+              <w:t>SmartMart</w:t>
+            </w:r>
+            <w:proofErr w:type="spellEnd"/>
+            <w:r>
+              <w:rPr>
+                <w:i/>
+                <w:iCs/>
+                <w:lang w:val="en-IN"/>
+              </w:rPr>
+              <w:t xml:space="preserve"> – An Automated Shopping Mart with Blink and Facial Recognition for Payment</w:t>
             </w:r>
             <w:r>
               <w:rPr>
@@ -5904,7 +6076,21 @@
         <w:rPr>
           <w:lang w:val="en-IN"/>
         </w:rPr>
-        <w:t>Existing demand forecasting systems mainly use statistical and machine learning models such as ARIMA, Linear Regression, Decision Trees, LSTM, and SVM for sales prediction in e-commerce platforms [1][2][3]. Although these models improve forecasting accuracy, many systems still depend heavily on historical sales data and fail to handle dynamic market trends, pricing changes, and customer behavior effectively [4]. Some advanced deep learning and hybrid models provide better accuracy but require high computational resources, large datasets, and complex parameter tuning [5][10].</w:t>
+        <w:t xml:space="preserve">Existing demand forecasting systems mainly use statistical and machine learning models such as ARIMA, Linear Regression, Decision Trees, LSTM, and SVM for sales prediction in e-commerce platforms [1][2][3]. Although these models improve forecasting accuracy, many systems still depend heavily on historical sales data and fail to handle dynamic market trends, pricing changes, and customer </w:t>
+      </w:r>
+      <w:proofErr w:type="spellStart"/>
+      <w:r>
+        <w:rPr>
+          <w:lang w:val="en-IN"/>
+        </w:rPr>
+        <w:t>behavior</w:t>
+      </w:r>
+      <w:proofErr w:type="spellEnd"/>
+      <w:r>
+        <w:rPr>
+          <w:lang w:val="en-IN"/>
+        </w:rPr>
+        <w:t xml:space="preserve"> effectively [4]. Some advanced deep learning and hybrid models provide better accuracy but require high computational resources, large datasets, and complex parameter tuning [5][10].</w:t>
       </w:r>
     </w:p>
     <w:p>
@@ -6036,7 +6222,21 @@
         <w:rPr>
           <w:lang w:val="en-IN"/>
         </w:rPr>
-        <w:t>The first step is Dataset Collection, where the dataset containing pricing and customer-related information is loaded into Google Colab. Next, Data Preprocessing is performed to prepare the dataset for analysis. This includes handling missing values, removing duplicates, formatting categorical data, and normalizing numerical features.</w:t>
+        <w:t xml:space="preserve">The first step is Dataset Collection, where the dataset containing pricing and customer-related information is loaded into Google </w:t>
+      </w:r>
+      <w:proofErr w:type="spellStart"/>
+      <w:r>
+        <w:rPr>
+          <w:lang w:val="en-IN"/>
+        </w:rPr>
+        <w:t>Colab</w:t>
+      </w:r>
+      <w:proofErr w:type="spellEnd"/>
+      <w:r>
+        <w:rPr>
+          <w:lang w:val="en-IN"/>
+        </w:rPr>
+        <w:t>. Next, Data Preprocessing is performed to prepare the dataset for analysis. This includes handling missing values, removing duplicates, formatting categorical data, and normalizing numerical features.</w:t>
       </w:r>
     </w:p>
     <w:p>
@@ -6084,7 +6284,21 @@
         <w:rPr>
           <w:lang w:val="en-IN"/>
         </w:rPr>
-        <w:t>Model performance is evaluated using metrics such as RMSE, MAE, Accuracy, Precision, Recall, and R² Score. Finally, the trained models generate demand predictions, and the results are analyzed using graphs and evaluation reports</w:t>
+        <w:t xml:space="preserve">Model performance is evaluated using metrics such as RMSE, MAE, Accuracy, Precision, Recall, and R² Score. Finally, the trained models generate demand predictions, and the results are </w:t>
+      </w:r>
+      <w:proofErr w:type="spellStart"/>
+      <w:r>
+        <w:rPr>
+          <w:lang w:val="en-IN"/>
+        </w:rPr>
+        <w:t>analyzed</w:t>
+      </w:r>
+      <w:proofErr w:type="spellEnd"/>
+      <w:r>
+        <w:rPr>
+          <w:lang w:val="en-IN"/>
+        </w:rPr>
+        <w:t xml:space="preserve"> using graphs and evaluation reports</w:t>
       </w:r>
       <w:r>
         <w:rPr>
@@ -6566,7 +6780,15 @@
         <w:jc w:val="both"/>
       </w:pPr>
       <w:r>
-        <w:t>This module collects and loads the dataset from CSV files or public e-commerce datasets into Google Colab for analysis.</w:t>
+        <w:t xml:space="preserve">This module collects and loads the dataset from CSV files or public e-commerce datasets into Google </w:t>
+      </w:r>
+      <w:proofErr w:type="spellStart"/>
+      <w:r>
+        <w:t>Colab</w:t>
+      </w:r>
+      <w:proofErr w:type="spellEnd"/>
+      <w:r>
+        <w:t xml:space="preserve"> for analysis.</w:t>
       </w:r>
     </w:p>
     <w:p>
@@ -7424,7 +7646,15 @@
         <w:jc w:val="both"/>
       </w:pPr>
       <w:r>
-        <w:t>The development environment for the proposed e-commerce demand forecasting system consists of software tools, Machine Learning libraries, and data processing technologies used for model development, training, testing, and visualization. The project is implemented using Python in the Google Colab platform, which provides an efficient cloud-based environment for Machine Learning experimentation and execution</w:t>
+        <w:t xml:space="preserve">The development environment for the proposed e-commerce demand forecasting system consists of software tools, Machine Learning libraries, and data processing technologies used for model development, training, testing, and visualization. The project is implemented using Python in the Google </w:t>
+      </w:r>
+      <w:proofErr w:type="spellStart"/>
+      <w:r>
+        <w:t>Colab</w:t>
+      </w:r>
+      <w:proofErr w:type="spellEnd"/>
+      <w:r>
+        <w:t xml:space="preserve"> platform, which provides an efficient cloud-based environment for Machine Learning experimentation and execution</w:t>
       </w:r>
       <w:r>
         <w:t>.</w:t>
@@ -7535,8 +7765,16 @@
               <w:rPr>
                 <w:lang w:val="en-IN"/>
               </w:rPr>
-              <w:t>Google Colab</w:t>
+              <w:t xml:space="preserve">Google </w:t>
             </w:r>
+            <w:proofErr w:type="spellStart"/>
+            <w:r>
+              <w:rPr>
+                <w:lang w:val="en-IN"/>
+              </w:rPr>
+              <w:t>Colab</w:t>
+            </w:r>
+            <w:proofErr w:type="spellEnd"/>
           </w:p>
         </w:tc>
         <w:tc>
@@ -8130,7 +8368,25 @@
           <w:szCs w:val="24"/>
           <w:lang w:val="en-IN"/>
         </w:rPr>
-        <w:t>The dataset includes both categorical and numerical attributes related to e-commerce transactions and customer behavior.</w:t>
+        <w:t xml:space="preserve">The dataset includes both categorical and numerical attributes related to e-commerce transactions and customer </w:t>
+      </w:r>
+      <w:proofErr w:type="spellStart"/>
+      <w:r>
+        <w:rPr>
+          <w:sz w:val="24"/>
+          <w:szCs w:val="24"/>
+          <w:lang w:val="en-IN"/>
+        </w:rPr>
+        <w:t>behavior</w:t>
+      </w:r>
+      <w:proofErr w:type="spellEnd"/>
+      <w:r>
+        <w:rPr>
+          <w:sz w:val="24"/>
+          <w:szCs w:val="24"/>
+          <w:lang w:val="en-IN"/>
+        </w:rPr>
+        <w:t>.</w:t>
       </w:r>
     </w:p>
     <w:p>
@@ -8378,7 +8634,25 @@
           <w:szCs w:val="24"/>
           <w:lang w:val="en-IN"/>
         </w:rPr>
-        <w:t>These features are used as input variables for training the Machine Learning models. The target output of the system is demand prediction in terms of units sold. The dataset supports both linear and non-linear analysis, making it suitable for implementing Linear Regression and Support Vector Machine (SVM) algorithms for demand forecasting</w:t>
+        <w:t xml:space="preserve">These features are used as input variables for training the Machine Learning models. The target output of the system is </w:t>
+      </w:r>
+      <w:proofErr w:type="gramStart"/>
+      <w:r>
+        <w:rPr>
+          <w:sz w:val="24"/>
+          <w:szCs w:val="24"/>
+          <w:lang w:val="en-IN"/>
+        </w:rPr>
+        <w:t>demand</w:t>
+      </w:r>
+      <w:proofErr w:type="gramEnd"/>
+      <w:r>
+        <w:rPr>
+          <w:sz w:val="24"/>
+          <w:szCs w:val="24"/>
+          <w:lang w:val="en-IN"/>
+        </w:rPr>
+        <w:t xml:space="preserve"> prediction in terms of units sold. The dataset supports both linear and non-linear analysis, making it suitable for implementing Linear Regression and Support Vector Machine (SVM) algorithms for demand forecasting</w:t>
       </w:r>
       <w:r>
         <w:rPr>
@@ -8431,7 +8705,151 @@
           <w:szCs w:val="24"/>
           <w:lang w:val="en-IN"/>
         </w:rPr>
-        <w:t>Data preprocessing was performed using Python libraries such as Pandas and Scikit-learn in Google Colab. The dataset was checked for missing values and duplicate records. The preprocessing results showed that there were no missing values in the dataset attributes such as category, brand_type, zone, sales_event, base_price, discount_percent, final_price, customer_age, and units_sold.</w:t>
+        <w:t xml:space="preserve">Data preprocessing was performed using Python libraries such as Pandas and Scikit-learn in Google </w:t>
+      </w:r>
+      <w:proofErr w:type="spellStart"/>
+      <w:r>
+        <w:rPr>
+          <w:sz w:val="24"/>
+          <w:szCs w:val="24"/>
+          <w:lang w:val="en-IN"/>
+        </w:rPr>
+        <w:t>Colab</w:t>
+      </w:r>
+      <w:proofErr w:type="spellEnd"/>
+      <w:r>
+        <w:rPr>
+          <w:sz w:val="24"/>
+          <w:szCs w:val="24"/>
+          <w:lang w:val="en-IN"/>
+        </w:rPr>
+        <w:t xml:space="preserve">. The dataset was checked for missing values and duplicate records. The preprocessing results showed that there were no missing values in the dataset attributes such as category, </w:t>
+      </w:r>
+      <w:proofErr w:type="spellStart"/>
+      <w:r>
+        <w:rPr>
+          <w:sz w:val="24"/>
+          <w:szCs w:val="24"/>
+          <w:lang w:val="en-IN"/>
+        </w:rPr>
+        <w:t>brand_type</w:t>
+      </w:r>
+      <w:proofErr w:type="spellEnd"/>
+      <w:r>
+        <w:rPr>
+          <w:sz w:val="24"/>
+          <w:szCs w:val="24"/>
+          <w:lang w:val="en-IN"/>
+        </w:rPr>
+        <w:t xml:space="preserve">, zone, </w:t>
+      </w:r>
+      <w:proofErr w:type="spellStart"/>
+      <w:r>
+        <w:rPr>
+          <w:sz w:val="24"/>
+          <w:szCs w:val="24"/>
+          <w:lang w:val="en-IN"/>
+        </w:rPr>
+        <w:t>sales_event</w:t>
+      </w:r>
+      <w:proofErr w:type="spellEnd"/>
+      <w:r>
+        <w:rPr>
+          <w:sz w:val="24"/>
+          <w:szCs w:val="24"/>
+          <w:lang w:val="en-IN"/>
+        </w:rPr>
+        <w:t xml:space="preserve">, </w:t>
+      </w:r>
+      <w:proofErr w:type="spellStart"/>
+      <w:r>
+        <w:rPr>
+          <w:sz w:val="24"/>
+          <w:szCs w:val="24"/>
+          <w:lang w:val="en-IN"/>
+        </w:rPr>
+        <w:t>base_price</w:t>
+      </w:r>
+      <w:proofErr w:type="spellEnd"/>
+      <w:r>
+        <w:rPr>
+          <w:sz w:val="24"/>
+          <w:szCs w:val="24"/>
+          <w:lang w:val="en-IN"/>
+        </w:rPr>
+        <w:t xml:space="preserve">, </w:t>
+      </w:r>
+      <w:proofErr w:type="spellStart"/>
+      <w:r>
+        <w:rPr>
+          <w:sz w:val="24"/>
+          <w:szCs w:val="24"/>
+          <w:lang w:val="en-IN"/>
+        </w:rPr>
+        <w:t>discount_percent</w:t>
+      </w:r>
+      <w:proofErr w:type="spellEnd"/>
+      <w:r>
+        <w:rPr>
+          <w:sz w:val="24"/>
+          <w:szCs w:val="24"/>
+          <w:lang w:val="en-IN"/>
+        </w:rPr>
+        <w:t xml:space="preserve">, </w:t>
+      </w:r>
+      <w:proofErr w:type="spellStart"/>
+      <w:r>
+        <w:rPr>
+          <w:sz w:val="24"/>
+          <w:szCs w:val="24"/>
+          <w:lang w:val="en-IN"/>
+        </w:rPr>
+        <w:t>final_price</w:t>
+      </w:r>
+      <w:proofErr w:type="spellEnd"/>
+      <w:r>
+        <w:rPr>
+          <w:sz w:val="24"/>
+          <w:szCs w:val="24"/>
+          <w:lang w:val="en-IN"/>
+        </w:rPr>
+        <w:t xml:space="preserve">, </w:t>
+      </w:r>
+      <w:proofErr w:type="spellStart"/>
+      <w:r>
+        <w:rPr>
+          <w:sz w:val="24"/>
+          <w:szCs w:val="24"/>
+          <w:lang w:val="en-IN"/>
+        </w:rPr>
+        <w:t>customer_age</w:t>
+      </w:r>
+      <w:proofErr w:type="spellEnd"/>
+      <w:r>
+        <w:rPr>
+          <w:sz w:val="24"/>
+          <w:szCs w:val="24"/>
+          <w:lang w:val="en-IN"/>
+        </w:rPr>
+        <w:t xml:space="preserve">, and </w:t>
+      </w:r>
+      <w:proofErr w:type="spellStart"/>
+      <w:r>
+        <w:rPr>
+          <w:sz w:val="24"/>
+          <w:szCs w:val="24"/>
+          <w:lang w:val="en-IN"/>
+        </w:rPr>
+        <w:t>units_sold</w:t>
+      </w:r>
+      <w:proofErr w:type="spellEnd"/>
+      <w:r>
+        <w:rPr>
+          <w:sz w:val="24"/>
+          <w:szCs w:val="24"/>
+          <w:lang w:val="en-IN"/>
+        </w:rPr>
+        <w:t>.</w:t>
       </w:r>
     </w:p>
     <w:p>
@@ -8450,7 +8868,43 @@
           <w:szCs w:val="24"/>
           <w:lang w:val="en-IN"/>
         </w:rPr>
-        <w:t>Duplicate records were removed, and the cleaned dataset contained 30,600 rows. Categorical features including category, brand_type, zone, and sales_event were converted into numerical format using One-Hot Encoding. After encoding, the dataset shape became (30600, 18).</w:t>
+        <w:t xml:space="preserve">Duplicate records were removed, and the cleaned dataset contained 30,600 rows. Categorical features including category, </w:t>
+      </w:r>
+      <w:proofErr w:type="spellStart"/>
+      <w:r>
+        <w:rPr>
+          <w:sz w:val="24"/>
+          <w:szCs w:val="24"/>
+          <w:lang w:val="en-IN"/>
+        </w:rPr>
+        <w:t>brand_type</w:t>
+      </w:r>
+      <w:proofErr w:type="spellEnd"/>
+      <w:r>
+        <w:rPr>
+          <w:sz w:val="24"/>
+          <w:szCs w:val="24"/>
+          <w:lang w:val="en-IN"/>
+        </w:rPr>
+        <w:t xml:space="preserve">, zone, and </w:t>
+      </w:r>
+      <w:proofErr w:type="spellStart"/>
+      <w:r>
+        <w:rPr>
+          <w:sz w:val="24"/>
+          <w:szCs w:val="24"/>
+          <w:lang w:val="en-IN"/>
+        </w:rPr>
+        <w:t>sales_event</w:t>
+      </w:r>
+      <w:proofErr w:type="spellEnd"/>
+      <w:r>
+        <w:rPr>
+          <w:sz w:val="24"/>
+          <w:szCs w:val="24"/>
+          <w:lang w:val="en-IN"/>
+        </w:rPr>
+        <w:t xml:space="preserve"> were converted into numerical format using One-Hot Encoding. After encoding, the dataset shape became (30600, 18).</w:t>
       </w:r>
     </w:p>
     <w:p>
@@ -8469,7 +8923,25 @@
           <w:szCs w:val="24"/>
           <w:lang w:val="en-IN"/>
         </w:rPr>
-        <w:t>The feature matrix X contained 17 input features, while the target vector Y contained the units_sold values. The dataset was divided into training and testing datasets using an 80:20 ratio, resulting in 24,480 training rows and 6,120 testing rows.</w:t>
+        <w:t xml:space="preserve">The feature matrix X contained 17 input features, while the target vector Y contained the </w:t>
+      </w:r>
+      <w:proofErr w:type="spellStart"/>
+      <w:r>
+        <w:rPr>
+          <w:sz w:val="24"/>
+          <w:szCs w:val="24"/>
+          <w:lang w:val="en-IN"/>
+        </w:rPr>
+        <w:t>units_sold</w:t>
+      </w:r>
+      <w:proofErr w:type="spellEnd"/>
+      <w:r>
+        <w:rPr>
+          <w:sz w:val="24"/>
+          <w:szCs w:val="24"/>
+          <w:lang w:val="en-IN"/>
+        </w:rPr>
+        <w:t xml:space="preserve"> values. The dataset was divided into training and testing datasets using an 80:20 ratio, resulting in 24,480 training rows and 6,120 testing rows.</w:t>
       </w:r>
     </w:p>
     <w:p>
@@ -8488,7 +8960,79 @@
           <w:szCs w:val="24"/>
           <w:lang w:val="en-IN"/>
         </w:rPr>
-        <w:t>Feature scaling was applied to numerical attributes such as base_price, discount_percent, final_price, and customer_age to improve model performance and maintain data consistency</w:t>
+        <w:t xml:space="preserve">Feature scaling was applied to numerical attributes such as </w:t>
+      </w:r>
+      <w:proofErr w:type="spellStart"/>
+      <w:r>
+        <w:rPr>
+          <w:sz w:val="24"/>
+          <w:szCs w:val="24"/>
+          <w:lang w:val="en-IN"/>
+        </w:rPr>
+        <w:t>base_price</w:t>
+      </w:r>
+      <w:proofErr w:type="spellEnd"/>
+      <w:r>
+        <w:rPr>
+          <w:sz w:val="24"/>
+          <w:szCs w:val="24"/>
+          <w:lang w:val="en-IN"/>
+        </w:rPr>
+        <w:t xml:space="preserve">, </w:t>
+      </w:r>
+      <w:proofErr w:type="spellStart"/>
+      <w:r>
+        <w:rPr>
+          <w:sz w:val="24"/>
+          <w:szCs w:val="24"/>
+          <w:lang w:val="en-IN"/>
+        </w:rPr>
+        <w:t>discount_percent</w:t>
+      </w:r>
+      <w:proofErr w:type="spellEnd"/>
+      <w:r>
+        <w:rPr>
+          <w:sz w:val="24"/>
+          <w:szCs w:val="24"/>
+          <w:lang w:val="en-IN"/>
+        </w:rPr>
+        <w:t xml:space="preserve">, </w:t>
+      </w:r>
+      <w:proofErr w:type="spellStart"/>
+      <w:r>
+        <w:rPr>
+          <w:sz w:val="24"/>
+          <w:szCs w:val="24"/>
+          <w:lang w:val="en-IN"/>
+        </w:rPr>
+        <w:t>final_price</w:t>
+      </w:r>
+      <w:proofErr w:type="spellEnd"/>
+      <w:r>
+        <w:rPr>
+          <w:sz w:val="24"/>
+          <w:szCs w:val="24"/>
+          <w:lang w:val="en-IN"/>
+        </w:rPr>
+        <w:t xml:space="preserve">, and </w:t>
+      </w:r>
+      <w:proofErr w:type="spellStart"/>
+      <w:r>
+        <w:rPr>
+          <w:sz w:val="24"/>
+          <w:szCs w:val="24"/>
+          <w:lang w:val="en-IN"/>
+        </w:rPr>
+        <w:t>customer_age</w:t>
+      </w:r>
+      <w:proofErr w:type="spellEnd"/>
+      <w:r>
+        <w:rPr>
+          <w:sz w:val="24"/>
+          <w:szCs w:val="24"/>
+          <w:lang w:val="en-IN"/>
+        </w:rPr>
+        <w:t xml:space="preserve"> to improve model performance and maintain data consistency</w:t>
       </w:r>
       <w:r>
         <w:rPr>
@@ -8661,7 +9205,7 @@
           <w:noProof/>
         </w:rPr>
         <w:drawing>
-          <wp:inline distT="0" distB="0" distL="0" distR="0" wp14:anchorId="445AFF36" wp14:editId="5DC37535">
+          <wp:inline distT="0" distB="0" distL="0" distR="0" wp14:anchorId="445AFF36" wp14:editId="0DD9CE53">
             <wp:extent cx="3231303" cy="2134945"/>
             <wp:effectExtent l="19050" t="19050" r="26670" b="17780"/>
             <wp:docPr id="1427276290" name="Picture 11"/>
@@ -8772,7 +9316,39 @@
           <w:sz w:val="24"/>
           <w:szCs w:val="24"/>
         </w:rPr>
-        <w:t xml:space="preserve"> represents the relationship between the feature final_price and the target variable units_sold. The green points represent the actual training data values, while the blue points represent the predicted values generated by the Linear Regression model. The red line indicates the best-fit regression line learned during training. The graph shows that the model attempts to capture the overall linear trend between final price and units sold</w:t>
+        <w:t xml:space="preserve"> represents the relationship between the feature </w:t>
+      </w:r>
+      <w:proofErr w:type="spellStart"/>
+      <w:r>
+        <w:rPr>
+          <w:sz w:val="24"/>
+          <w:szCs w:val="24"/>
+        </w:rPr>
+        <w:t>final_price</w:t>
+      </w:r>
+      <w:proofErr w:type="spellEnd"/>
+      <w:r>
+        <w:rPr>
+          <w:sz w:val="24"/>
+          <w:szCs w:val="24"/>
+        </w:rPr>
+        <w:t xml:space="preserve"> and the target variable </w:t>
+      </w:r>
+      <w:proofErr w:type="spellStart"/>
+      <w:r>
+        <w:rPr>
+          <w:sz w:val="24"/>
+          <w:szCs w:val="24"/>
+        </w:rPr>
+        <w:t>units_sold</w:t>
+      </w:r>
+      <w:proofErr w:type="spellEnd"/>
+      <w:r>
+        <w:rPr>
+          <w:sz w:val="24"/>
+          <w:szCs w:val="24"/>
+        </w:rPr>
+        <w:t>. The green points represent the actual training data values, while the blue points represent the predicted values generated by the Linear Regression model. The red line indicates the best-fit regression line learned during training. The graph shows that the model attempts to capture the overall linear trend between final price and units sold</w:t>
       </w:r>
       <w:r>
         <w:rPr>
@@ -8797,7 +9373,7 @@
           <w:noProof/>
         </w:rPr>
         <w:drawing>
-          <wp:inline distT="0" distB="0" distL="0" distR="0" wp14:anchorId="230C83C2" wp14:editId="167D3E15">
+          <wp:inline distT="0" distB="0" distL="0" distR="0" wp14:anchorId="230C83C2" wp14:editId="004C6560">
             <wp:extent cx="3718137" cy="2206952"/>
             <wp:effectExtent l="19050" t="19050" r="15875" b="22225"/>
             <wp:docPr id="399135035" name="Picture 12"/>
@@ -9313,7 +9889,7 @@
           <w:noProof/>
         </w:rPr>
         <w:drawing>
-          <wp:inline distT="0" distB="0" distL="0" distR="0" wp14:anchorId="3A40381D" wp14:editId="07E5D085">
+          <wp:inline distT="0" distB="0" distL="0" distR="0" wp14:anchorId="3A40381D" wp14:editId="3AE50DBA">
             <wp:extent cx="4658620" cy="1905000"/>
             <wp:effectExtent l="19050" t="19050" r="27940" b="19050"/>
             <wp:docPr id="111649717" name="Picture 19"/>
@@ -9398,7 +9974,21 @@
         <w:rPr>
           <w:lang w:val="en-IN"/>
         </w:rPr>
-        <w:t>Figure 5.1 shows the comparison between actual values and predicted values generated by Linear Regression and SVR models. The graph indicates that both models follow the overall trend of demand patterns. However, slight variations can be observed between actual and predicted outputs due to non-linear variations and dynamic pricing behavior in the dataset.</w:t>
+        <w:t xml:space="preserve">Figure 5.1 shows the comparison between actual values and predicted values generated by Linear Regression and SVR models. The graph indicates that both models follow the overall trend of demand patterns. However, slight variations can be observed between actual and predicted outputs due to non-linear variations and dynamic pricing </w:t>
+      </w:r>
+      <w:proofErr w:type="spellStart"/>
+      <w:r>
+        <w:rPr>
+          <w:lang w:val="en-IN"/>
+        </w:rPr>
+        <w:t>behavior</w:t>
+      </w:r>
+      <w:proofErr w:type="spellEnd"/>
+      <w:r>
+        <w:rPr>
+          <w:lang w:val="en-IN"/>
+        </w:rPr>
+        <w:t xml:space="preserve"> in the dataset.</w:t>
       </w:r>
     </w:p>
     <w:p>
@@ -11410,7 +12000,25 @@
           <w:szCs w:val="24"/>
           <w:lang w:val="en-IN"/>
         </w:rPr>
-        <w:t xml:space="preserve">Linear Regression MAE : </w:t>
+        <w:t xml:space="preserve">Linear Regression </w:t>
+      </w:r>
+      <w:proofErr w:type="gramStart"/>
+      <w:r>
+        <w:rPr>
+          <w:sz w:val="24"/>
+          <w:szCs w:val="24"/>
+          <w:lang w:val="en-IN"/>
+        </w:rPr>
+        <w:t>MAE :</w:t>
+      </w:r>
+      <w:proofErr w:type="gramEnd"/>
+      <w:r>
+        <w:rPr>
+          <w:sz w:val="24"/>
+          <w:szCs w:val="24"/>
+          <w:lang w:val="en-IN"/>
+        </w:rPr>
+        <w:t xml:space="preserve"> </w:t>
       </w:r>
       <w:r>
         <w:rPr>
@@ -11449,7 +12057,25 @@
           <w:szCs w:val="24"/>
           <w:lang w:val="en-IN"/>
         </w:rPr>
-        <w:t xml:space="preserve">SVR MAE : </w:t>
+        <w:t xml:space="preserve">SVR </w:t>
+      </w:r>
+      <w:proofErr w:type="gramStart"/>
+      <w:r>
+        <w:rPr>
+          <w:sz w:val="24"/>
+          <w:szCs w:val="24"/>
+          <w:lang w:val="en-IN"/>
+        </w:rPr>
+        <w:t>MAE :</w:t>
+      </w:r>
+      <w:proofErr w:type="gramEnd"/>
+      <w:r>
+        <w:rPr>
+          <w:sz w:val="24"/>
+          <w:szCs w:val="24"/>
+          <w:lang w:val="en-IN"/>
+        </w:rPr>
+        <w:t xml:space="preserve"> </w:t>
       </w:r>
       <w:r>
         <w:rPr>
@@ -11549,7 +12175,25 @@
           <w:szCs w:val="24"/>
           <w:lang w:val="en-IN"/>
         </w:rPr>
-        <w:t xml:space="preserve">Linear Regression MSE : </w:t>
+        <w:t xml:space="preserve">Linear Regression </w:t>
+      </w:r>
+      <w:proofErr w:type="gramStart"/>
+      <w:r>
+        <w:rPr>
+          <w:sz w:val="24"/>
+          <w:szCs w:val="24"/>
+          <w:lang w:val="en-IN"/>
+        </w:rPr>
+        <w:t>MSE :</w:t>
+      </w:r>
+      <w:proofErr w:type="gramEnd"/>
+      <w:r>
+        <w:rPr>
+          <w:sz w:val="24"/>
+          <w:szCs w:val="24"/>
+          <w:lang w:val="en-IN"/>
+        </w:rPr>
+        <w:t xml:space="preserve"> </w:t>
       </w:r>
       <w:r>
         <w:rPr>
@@ -11588,7 +12232,25 @@
           <w:szCs w:val="24"/>
           <w:lang w:val="en-IN"/>
         </w:rPr>
-        <w:t xml:space="preserve">SVR MSE : </w:t>
+        <w:t xml:space="preserve">SVR </w:t>
+      </w:r>
+      <w:proofErr w:type="gramStart"/>
+      <w:r>
+        <w:rPr>
+          <w:sz w:val="24"/>
+          <w:szCs w:val="24"/>
+          <w:lang w:val="en-IN"/>
+        </w:rPr>
+        <w:t>MSE :</w:t>
+      </w:r>
+      <w:proofErr w:type="gramEnd"/>
+      <w:r>
+        <w:rPr>
+          <w:sz w:val="24"/>
+          <w:szCs w:val="24"/>
+          <w:lang w:val="en-IN"/>
+        </w:rPr>
+        <w:t xml:space="preserve"> </w:t>
       </w:r>
       <w:r>
         <w:rPr>
@@ -11680,7 +12342,25 @@
           <w:szCs w:val="24"/>
           <w:lang w:val="en-IN"/>
         </w:rPr>
-        <w:t xml:space="preserve">Linear Regression RMSE : </w:t>
+        <w:t xml:space="preserve">Linear Regression </w:t>
+      </w:r>
+      <w:proofErr w:type="gramStart"/>
+      <w:r>
+        <w:rPr>
+          <w:sz w:val="24"/>
+          <w:szCs w:val="24"/>
+          <w:lang w:val="en-IN"/>
+        </w:rPr>
+        <w:t>RMSE :</w:t>
+      </w:r>
+      <w:proofErr w:type="gramEnd"/>
+      <w:r>
+        <w:rPr>
+          <w:sz w:val="24"/>
+          <w:szCs w:val="24"/>
+          <w:lang w:val="en-IN"/>
+        </w:rPr>
+        <w:t xml:space="preserve"> </w:t>
       </w:r>
       <w:r>
         <w:rPr>
@@ -11719,7 +12399,25 @@
           <w:szCs w:val="24"/>
           <w:lang w:val="en-IN"/>
         </w:rPr>
-        <w:t xml:space="preserve">SVR RMSE : </w:t>
+        <w:t xml:space="preserve">SVR </w:t>
+      </w:r>
+      <w:proofErr w:type="gramStart"/>
+      <w:r>
+        <w:rPr>
+          <w:sz w:val="24"/>
+          <w:szCs w:val="24"/>
+          <w:lang w:val="en-IN"/>
+        </w:rPr>
+        <w:t>RMSE :</w:t>
+      </w:r>
+      <w:proofErr w:type="gramEnd"/>
+      <w:r>
+        <w:rPr>
+          <w:sz w:val="24"/>
+          <w:szCs w:val="24"/>
+          <w:lang w:val="en-IN"/>
+        </w:rPr>
+        <w:t xml:space="preserve"> </w:t>
       </w:r>
       <w:r>
         <w:rPr>
@@ -11940,7 +12638,25 @@
           <w:szCs w:val="24"/>
           <w:lang w:val="en-IN"/>
         </w:rPr>
-        <w:t xml:space="preserve">Linear Regression R² Score : 0.3549 </w:t>
+        <w:t xml:space="preserve">Linear Regression R² </w:t>
+      </w:r>
+      <w:proofErr w:type="gramStart"/>
+      <w:r>
+        <w:rPr>
+          <w:sz w:val="24"/>
+          <w:szCs w:val="24"/>
+          <w:lang w:val="en-IN"/>
+        </w:rPr>
+        <w:t>Score :</w:t>
+      </w:r>
+      <w:proofErr w:type="gramEnd"/>
+      <w:r>
+        <w:rPr>
+          <w:sz w:val="24"/>
+          <w:szCs w:val="24"/>
+          <w:lang w:val="en-IN"/>
+        </w:rPr>
+        <w:t xml:space="preserve"> 0.3549 </w:t>
       </w:r>
     </w:p>
     <w:p>
@@ -11963,7 +12679,25 @@
           <w:szCs w:val="24"/>
           <w:lang w:val="en-IN"/>
         </w:rPr>
-        <w:t xml:space="preserve">SVR R² Score : 0.3510 </w:t>
+        <w:t xml:space="preserve">SVR R² </w:t>
+      </w:r>
+      <w:proofErr w:type="gramStart"/>
+      <w:r>
+        <w:rPr>
+          <w:sz w:val="24"/>
+          <w:szCs w:val="24"/>
+          <w:lang w:val="en-IN"/>
+        </w:rPr>
+        <w:t>Score :</w:t>
+      </w:r>
+      <w:proofErr w:type="gramEnd"/>
+      <w:r>
+        <w:rPr>
+          <w:sz w:val="24"/>
+          <w:szCs w:val="24"/>
+          <w:lang w:val="en-IN"/>
+        </w:rPr>
+        <w:t xml:space="preserve"> 0.3510 </w:t>
       </w:r>
     </w:p>
     <w:p>
@@ -12216,7 +12950,25 @@
           <w:szCs w:val="24"/>
           <w:lang w:val="en-IN"/>
         </w:rPr>
-        <w:t xml:space="preserve">Linear Regression Accuracy : 0.6776 </w:t>
+        <w:t xml:space="preserve">Linear Regression </w:t>
+      </w:r>
+      <w:proofErr w:type="gramStart"/>
+      <w:r>
+        <w:rPr>
+          <w:sz w:val="24"/>
+          <w:szCs w:val="24"/>
+          <w:lang w:val="en-IN"/>
+        </w:rPr>
+        <w:t>Accuracy :</w:t>
+      </w:r>
+      <w:proofErr w:type="gramEnd"/>
+      <w:r>
+        <w:rPr>
+          <w:sz w:val="24"/>
+          <w:szCs w:val="24"/>
+          <w:lang w:val="en-IN"/>
+        </w:rPr>
+        <w:t xml:space="preserve"> 0.6776 </w:t>
       </w:r>
     </w:p>
     <w:p>
@@ -12239,7 +12991,25 @@
           <w:szCs w:val="24"/>
           <w:lang w:val="en-IN"/>
         </w:rPr>
-        <w:t xml:space="preserve">SVR Accuracy : 0.6815 </w:t>
+        <w:t xml:space="preserve">SVR </w:t>
+      </w:r>
+      <w:proofErr w:type="gramStart"/>
+      <w:r>
+        <w:rPr>
+          <w:sz w:val="24"/>
+          <w:szCs w:val="24"/>
+          <w:lang w:val="en-IN"/>
+        </w:rPr>
+        <w:t>Accuracy :</w:t>
+      </w:r>
+      <w:proofErr w:type="gramEnd"/>
+      <w:r>
+        <w:rPr>
+          <w:sz w:val="24"/>
+          <w:szCs w:val="24"/>
+          <w:lang w:val="en-IN"/>
+        </w:rPr>
+        <w:t xml:space="preserve"> 0.6815 </w:t>
       </w:r>
     </w:p>
     <w:p>
@@ -12323,7 +13093,25 @@
           <w:szCs w:val="24"/>
           <w:lang w:val="en-IN"/>
         </w:rPr>
-        <w:t xml:space="preserve">Linear Regression Precision : 0.6206 </w:t>
+        <w:t xml:space="preserve">Linear Regression </w:t>
+      </w:r>
+      <w:proofErr w:type="gramStart"/>
+      <w:r>
+        <w:rPr>
+          <w:sz w:val="24"/>
+          <w:szCs w:val="24"/>
+          <w:lang w:val="en-IN"/>
+        </w:rPr>
+        <w:t>Precision :</w:t>
+      </w:r>
+      <w:proofErr w:type="gramEnd"/>
+      <w:r>
+        <w:rPr>
+          <w:sz w:val="24"/>
+          <w:szCs w:val="24"/>
+          <w:lang w:val="en-IN"/>
+        </w:rPr>
+        <w:t xml:space="preserve"> 0.6206 </w:t>
       </w:r>
     </w:p>
     <w:p>
@@ -12346,7 +13134,25 @@
           <w:szCs w:val="24"/>
           <w:lang w:val="en-IN"/>
         </w:rPr>
-        <w:t xml:space="preserve">SVR Precision : 0.6442 </w:t>
+        <w:t xml:space="preserve">SVR </w:t>
+      </w:r>
+      <w:proofErr w:type="gramStart"/>
+      <w:r>
+        <w:rPr>
+          <w:sz w:val="24"/>
+          <w:szCs w:val="24"/>
+          <w:lang w:val="en-IN"/>
+        </w:rPr>
+        <w:t>Precision :</w:t>
+      </w:r>
+      <w:proofErr w:type="gramEnd"/>
+      <w:r>
+        <w:rPr>
+          <w:sz w:val="24"/>
+          <w:szCs w:val="24"/>
+          <w:lang w:val="en-IN"/>
+        </w:rPr>
+        <w:t xml:space="preserve"> 0.6442 </w:t>
       </w:r>
     </w:p>
     <w:p>
@@ -12430,7 +13236,25 @@
           <w:szCs w:val="24"/>
           <w:lang w:val="en-IN"/>
         </w:rPr>
-        <w:t xml:space="preserve">Linear Regression Recall : 0.6996 </w:t>
+        <w:t xml:space="preserve">Linear Regression </w:t>
+      </w:r>
+      <w:proofErr w:type="gramStart"/>
+      <w:r>
+        <w:rPr>
+          <w:sz w:val="24"/>
+          <w:szCs w:val="24"/>
+          <w:lang w:val="en-IN"/>
+        </w:rPr>
+        <w:t>Recall :</w:t>
+      </w:r>
+      <w:proofErr w:type="gramEnd"/>
+      <w:r>
+        <w:rPr>
+          <w:sz w:val="24"/>
+          <w:szCs w:val="24"/>
+          <w:lang w:val="en-IN"/>
+        </w:rPr>
+        <w:t xml:space="preserve"> 0.6996 </w:t>
       </w:r>
     </w:p>
     <w:p>
@@ -12453,7 +13277,25 @@
           <w:szCs w:val="24"/>
           <w:lang w:val="en-IN"/>
         </w:rPr>
-        <w:t xml:space="preserve">SVR Recall : 0.6273 </w:t>
+        <w:t xml:space="preserve">SVR </w:t>
+      </w:r>
+      <w:proofErr w:type="gramStart"/>
+      <w:r>
+        <w:rPr>
+          <w:sz w:val="24"/>
+          <w:szCs w:val="24"/>
+          <w:lang w:val="en-IN"/>
+        </w:rPr>
+        <w:t>Recall :</w:t>
+      </w:r>
+      <w:proofErr w:type="gramEnd"/>
+      <w:r>
+        <w:rPr>
+          <w:sz w:val="24"/>
+          <w:szCs w:val="24"/>
+          <w:lang w:val="en-IN"/>
+        </w:rPr>
+        <w:t xml:space="preserve"> 0.6273 </w:t>
       </w:r>
     </w:p>
     <w:p>
@@ -12537,7 +13379,25 @@
           <w:szCs w:val="24"/>
           <w:lang w:val="en-IN"/>
         </w:rPr>
-        <w:t xml:space="preserve">Linear Regression F1-Score : 0.6578 </w:t>
+        <w:t>Linear Regression F1-</w:t>
+      </w:r>
+      <w:proofErr w:type="gramStart"/>
+      <w:r>
+        <w:rPr>
+          <w:sz w:val="24"/>
+          <w:szCs w:val="24"/>
+          <w:lang w:val="en-IN"/>
+        </w:rPr>
+        <w:t>Score :</w:t>
+      </w:r>
+      <w:proofErr w:type="gramEnd"/>
+      <w:r>
+        <w:rPr>
+          <w:sz w:val="24"/>
+          <w:szCs w:val="24"/>
+          <w:lang w:val="en-IN"/>
+        </w:rPr>
+        <w:t xml:space="preserve"> 0.6578 </w:t>
       </w:r>
     </w:p>
     <w:p>
@@ -12560,7 +13420,25 @@
           <w:szCs w:val="24"/>
           <w:lang w:val="en-IN"/>
         </w:rPr>
-        <w:t xml:space="preserve">SVR F1-Score : 0.6356 </w:t>
+        <w:t>SVR F1-</w:t>
+      </w:r>
+      <w:proofErr w:type="gramStart"/>
+      <w:r>
+        <w:rPr>
+          <w:sz w:val="24"/>
+          <w:szCs w:val="24"/>
+          <w:lang w:val="en-IN"/>
+        </w:rPr>
+        <w:t>Score :</w:t>
+      </w:r>
+      <w:proofErr w:type="gramEnd"/>
+      <w:r>
+        <w:rPr>
+          <w:sz w:val="24"/>
+          <w:szCs w:val="24"/>
+          <w:lang w:val="en-IN"/>
+        </w:rPr>
+        <w:t xml:space="preserve"> 0.6356 </w:t>
       </w:r>
     </w:p>
     <w:p>
@@ -12699,13 +13577,13 @@
       </w:pPr>
       <w:r>
         <w:rPr>
-          <w:noProof/>
+          <w:lang w:val="en-IN"/>
         </w:rPr>
         <w:drawing>
-          <wp:inline distT="0" distB="0" distL="0" distR="0" wp14:anchorId="38C861C9" wp14:editId="0B0C6FD9">
-            <wp:extent cx="2563606" cy="1943100"/>
-            <wp:effectExtent l="19050" t="19050" r="27305" b="19050"/>
-            <wp:docPr id="27382263" name="Picture 23"/>
+          <wp:inline distT="0" distB="0" distL="0" distR="0" wp14:anchorId="01C2FF1B" wp14:editId="1479E5D2">
+            <wp:extent cx="3028510" cy="2313802"/>
+            <wp:effectExtent l="19050" t="19050" r="19685" b="10795"/>
+            <wp:docPr id="550037250" name="Picture 1"/>
             <wp:cNvGraphicFramePr>
               <a:graphicFrameLocks xmlns:a="http://schemas.openxmlformats.org/drawingml/2006/main" noChangeAspect="1"/>
             </wp:cNvGraphicFramePr>
@@ -12713,33 +13591,23 @@
               <a:graphicData uri="http://schemas.openxmlformats.org/drawingml/2006/picture">
                 <pic:pic xmlns:pic="http://schemas.openxmlformats.org/drawingml/2006/picture">
                   <pic:nvPicPr>
-                    <pic:cNvPr id="0" name="Picture 15"/>
-                    <pic:cNvPicPr>
-                      <a:picLocks noChangeAspect="1" noChangeArrowheads="1"/>
-                    </pic:cNvPicPr>
+                    <pic:cNvPr id="550037250" name=""/>
+                    <pic:cNvPicPr/>
                   </pic:nvPicPr>
                   <pic:blipFill>
-                    <a:blip r:embed="rId28">
-                      <a:extLst>
-                        <a:ext uri="{28A0092B-C50C-407E-A947-70E740481C1C}">
-                          <a14:useLocalDpi xmlns:a14="http://schemas.microsoft.com/office/drawing/2010/main" val="0"/>
-                        </a:ext>
-                      </a:extLst>
-                    </a:blip>
-                    <a:srcRect/>
+                    <a:blip r:embed="rId28"/>
                     <a:stretch>
                       <a:fillRect/>
                     </a:stretch>
                   </pic:blipFill>
-                  <pic:spPr bwMode="auto">
+                  <pic:spPr>
                     <a:xfrm>
                       <a:off x="0" y="0"/>
-                      <a:ext cx="2573018" cy="1950234"/>
+                      <a:ext cx="3059300" cy="2337326"/>
                     </a:xfrm>
                     <a:prstGeom prst="rect">
                       <a:avLst/>
                     </a:prstGeom>
-                    <a:noFill/>
                     <a:ln w="12700">
                       <a:solidFill>
                         <a:schemeClr val="tx1"/>
@@ -12936,13 +13804,13 @@
       </w:pPr>
       <w:r>
         <w:rPr>
-          <w:noProof/>
+          <w:lang w:val="en-IN"/>
         </w:rPr>
         <w:drawing>
-          <wp:inline distT="0" distB="0" distL="0" distR="0" wp14:anchorId="315BF48A" wp14:editId="5476B796">
-            <wp:extent cx="2909889" cy="2205567"/>
-            <wp:effectExtent l="19050" t="19050" r="24130" b="23495"/>
-            <wp:docPr id="379042928" name="Picture 24"/>
+          <wp:inline distT="0" distB="0" distL="0" distR="0" wp14:anchorId="00832637" wp14:editId="7B780D56">
+            <wp:extent cx="2898238" cy="2214273"/>
+            <wp:effectExtent l="19050" t="19050" r="16510" b="14605"/>
+            <wp:docPr id="1905333463" name="Picture 1"/>
             <wp:cNvGraphicFramePr>
               <a:graphicFrameLocks xmlns:a="http://schemas.openxmlformats.org/drawingml/2006/main" noChangeAspect="1"/>
             </wp:cNvGraphicFramePr>
@@ -12950,33 +13818,23 @@
               <a:graphicData uri="http://schemas.openxmlformats.org/drawingml/2006/picture">
                 <pic:pic xmlns:pic="http://schemas.openxmlformats.org/drawingml/2006/picture">
                   <pic:nvPicPr>
-                    <pic:cNvPr id="0" name="Picture 17"/>
-                    <pic:cNvPicPr>
-                      <a:picLocks noChangeAspect="1" noChangeArrowheads="1"/>
-                    </pic:cNvPicPr>
+                    <pic:cNvPr id="1905333463" name=""/>
+                    <pic:cNvPicPr/>
                   </pic:nvPicPr>
                   <pic:blipFill>
-                    <a:blip r:embed="rId29">
-                      <a:extLst>
-                        <a:ext uri="{28A0092B-C50C-407E-A947-70E740481C1C}">
-                          <a14:useLocalDpi xmlns:a14="http://schemas.microsoft.com/office/drawing/2010/main" val="0"/>
-                        </a:ext>
-                      </a:extLst>
-                    </a:blip>
-                    <a:srcRect/>
+                    <a:blip r:embed="rId29"/>
                     <a:stretch>
                       <a:fillRect/>
                     </a:stretch>
                   </pic:blipFill>
-                  <pic:spPr bwMode="auto">
+                  <pic:spPr>
                     <a:xfrm>
                       <a:off x="0" y="0"/>
-                      <a:ext cx="2915248" cy="2209629"/>
+                      <a:ext cx="2913040" cy="2225581"/>
                     </a:xfrm>
                     <a:prstGeom prst="rect">
                       <a:avLst/>
                     </a:prstGeom>
-                    <a:noFill/>
                     <a:ln w="12700">
                       <a:solidFill>
                         <a:schemeClr val="tx1"/>
@@ -13704,7 +14562,25 @@
           <w:szCs w:val="24"/>
           <w:lang w:val="en-IN"/>
         </w:rPr>
-        <w:t>The project methodology included dataset collection, data preprocessing, feature selection, model training, prediction generation, and performance evaluation. Python libraries such as Pandas, NumPy, Matplotlib, and Scikit-learn were used in Google Colab for implementation. Important features such as Category, Brand Type, Zone, Sales Event, Base Price, Discount, Final Price, and Customer Age were used for training the models.</w:t>
+        <w:t xml:space="preserve">The project methodology included dataset collection, data preprocessing, feature selection, model training, prediction generation, and performance evaluation. Python libraries such as Pandas, NumPy, Matplotlib, and Scikit-learn were used in Google </w:t>
+      </w:r>
+      <w:proofErr w:type="spellStart"/>
+      <w:r>
+        <w:rPr>
+          <w:sz w:val="24"/>
+          <w:szCs w:val="24"/>
+          <w:lang w:val="en-IN"/>
+        </w:rPr>
+        <w:t>Colab</w:t>
+      </w:r>
+      <w:proofErr w:type="spellEnd"/>
+      <w:r>
+        <w:rPr>
+          <w:sz w:val="24"/>
+          <w:szCs w:val="24"/>
+          <w:lang w:val="en-IN"/>
+        </w:rPr>
+        <w:t xml:space="preserve"> for implementation. Important features such as Category, Brand Type, Zone, Sales Event, Base Price, Discount, Final Price, and Customer Age were used for training the models.</w:t>
       </w:r>
     </w:p>
     <w:p>
@@ -13969,13 +14845,23 @@
           <w:lang w:val="en-IN" w:eastAsia="en-IN"/>
         </w:rPr>
       </w:pPr>
+      <w:proofErr w:type="spellStart"/>
       <w:r>
         <w:rPr>
           <w:sz w:val="24"/>
           <w:szCs w:val="24"/>
           <w:lang w:val="en-IN" w:eastAsia="en-IN"/>
         </w:rPr>
-        <w:t>SmartMart – An Automated Shopping Mart with Blink and Facial Recognition for Payment, 2023.</w:t>
+        <w:t>SmartMart</w:t>
+      </w:r>
+      <w:proofErr w:type="spellEnd"/>
+      <w:r>
+        <w:rPr>
+          <w:sz w:val="24"/>
+          <w:szCs w:val="24"/>
+          <w:lang w:val="en-IN" w:eastAsia="en-IN"/>
+        </w:rPr>
+        <w:t xml:space="preserve"> – An Automated Shopping Mart with Blink and Facial Recognition for Payment, 2023.</w:t>
       </w:r>
     </w:p>
     <w:p>
@@ -14206,8 +15092,16 @@
                             <w:rPr>
                               <w:spacing w:val="-5"/>
                             </w:rPr>
-                            <w:t>iii</w:t>
+                            <w:t>ii</w:t>
                           </w:r>
+                          <w:proofErr w:type="spellStart"/>
+                          <w:r>
+                            <w:rPr>
+                              <w:spacing w:val="-5"/>
+                            </w:rPr>
+                            <w:t>i</w:t>
+                          </w:r>
+                          <w:proofErr w:type="spellEnd"/>
                           <w:r>
                             <w:rPr>
                               <w:spacing w:val="-5"/>

</xml_diff>

<commit_message>
Update ML presentation with latest analysis findings
</commit_message>
<xml_diff>
--- a/Documentation/ML_project.docx
+++ b/Documentation/ML_project.docx
@@ -1845,6 +1845,8 @@
         <w:ind w:left="141" w:right="281" w:firstLine="351"/>
         <w:jc w:val="both"/>
         <w:rPr>
+          <w:sz w:val="24"/>
+          <w:szCs w:val="24"/>
           <w:lang w:val="en-IN"/>
         </w:rPr>
       </w:pPr>
@@ -2309,6 +2311,8 @@
       </w:r>
       <w:r>
         <w:rPr>
+          <w:sz w:val="24"/>
+          <w:szCs w:val="24"/>
           <w:lang w:val="en-IN"/>
         </w:rPr>
         <w:t>The Machine Learning Project report has been approved as it satisfies the academic requirements in respect of project work for the award of the degree.</w:t>
@@ -9205,7 +9209,7 @@
           <w:noProof/>
         </w:rPr>
         <w:drawing>
-          <wp:inline distT="0" distB="0" distL="0" distR="0" wp14:anchorId="445AFF36" wp14:editId="0DD9CE53">
+          <wp:inline distT="0" distB="0" distL="0" distR="0" wp14:anchorId="445AFF36" wp14:editId="7CE698DD">
             <wp:extent cx="3231303" cy="2134945"/>
             <wp:effectExtent l="19050" t="19050" r="26670" b="17780"/>
             <wp:docPr id="1427276290" name="Picture 11"/>
@@ -9373,7 +9377,7 @@
           <w:noProof/>
         </w:rPr>
         <w:drawing>
-          <wp:inline distT="0" distB="0" distL="0" distR="0" wp14:anchorId="230C83C2" wp14:editId="004C6560">
+          <wp:inline distT="0" distB="0" distL="0" distR="0" wp14:anchorId="230C83C2" wp14:editId="5632FB7C">
             <wp:extent cx="3718137" cy="2206952"/>
             <wp:effectExtent l="19050" t="19050" r="15875" b="22225"/>
             <wp:docPr id="399135035" name="Picture 12"/>
@@ -9889,7 +9893,7 @@
           <w:noProof/>
         </w:rPr>
         <w:drawing>
-          <wp:inline distT="0" distB="0" distL="0" distR="0" wp14:anchorId="3A40381D" wp14:editId="3AE50DBA">
+          <wp:inline distT="0" distB="0" distL="0" distR="0" wp14:anchorId="3A40381D" wp14:editId="5C702B1E">
             <wp:extent cx="4658620" cy="1905000"/>
             <wp:effectExtent l="19050" t="19050" r="27940" b="19050"/>
             <wp:docPr id="111649717" name="Picture 19"/>
@@ -13577,6 +13581,7 @@
       </w:pPr>
       <w:r>
         <w:rPr>
+          <w:noProof/>
           <w:lang w:val="en-IN"/>
         </w:rPr>
         <w:drawing>
@@ -13804,6 +13809,7 @@
       </w:pPr>
       <w:r>
         <w:rPr>
+          <w:noProof/>
           <w:lang w:val="en-IN"/>
         </w:rPr>
         <w:drawing>
@@ -15092,16 +15098,8 @@
                             <w:rPr>
                               <w:spacing w:val="-5"/>
                             </w:rPr>
-                            <w:t>ii</w:t>
+                            <w:t>iii</w:t>
                           </w:r>
-                          <w:proofErr w:type="spellStart"/>
-                          <w:r>
-                            <w:rPr>
-                              <w:spacing w:val="-5"/>
-                            </w:rPr>
-                            <w:t>i</w:t>
-                          </w:r>
-                          <w:proofErr w:type="spellEnd"/>
                           <w:r>
                             <w:rPr>
                               <w:spacing w:val="-5"/>

</xml_diff>